<commit_message>
Update AI grading prompt with lenient rules
</commit_message>
<xml_diff>
--- a/Questions/sample.docx
+++ b/Questions/sample.docx
@@ -1,6 +1,6 @@
 
 <file path=word/document.xml><?xml version="1.0" encoding="utf-8"?>
-<w:document xmlns:wpc="http://schemas.microsoft.com/office/word/2010/wordprocessingCanvas" xmlns:cx="http://schemas.microsoft.com/office/drawing/2014/chartex" xmlns:cx1="http://schemas.microsoft.com/office/drawing/2015/9/8/chartex" xmlns:cx2="http://schemas.microsoft.com/office/drawing/2015/10/21/chartex" xmlns:cx3="http://schemas.microsoft.com/office/drawing/2016/5/9/chartex" xmlns:cx4="http://schemas.microsoft.com/office/drawing/2016/5/10/chartex" xmlns:cx5="http://schemas.microsoft.com/office/drawing/2016/5/11/chartex" xmlns:cx6="http://schemas.microsoft.com/office/drawing/2016/5/12/chartex" xmlns:cx7="http://schemas.microsoft.com/office/drawing/2016/5/13/chartex" xmlns:cx8="http://schemas.microsoft.com/office/drawing/2016/5/14/chartex" xmlns:mc="http://schemas.openxmlformats.org/markup-compatibility/2006" xmlns:aink="http://schemas.microsoft.com/office/drawing/2016/ink" xmlns:am3d="http://schemas.microsoft.com/office/drawing/2017/model3d" xmlns:o="urn:schemas-microsoft-com:office:office" xmlns:oel="http://schemas.microsoft.com/office/2019/extlst" xmlns:r="http://schemas.openxmlformats.org/officeDocument/2006/relationships" xmlns:m="http://schemas.openxmlformats.org/officeDocument/2006/math" xmlns:v="urn:schemas-microsoft-com:vml" xmlns:wp14="http://schemas.microsoft.com/office/word/2010/wordprocessingDrawing" xmlns:wp="http://schemas.openxmlformats.org/drawingml/2006/wordprocessingDrawing" xmlns:w10="urn:schemas-microsoft-com:office:word" xmlns:w="http://schemas.openxmlformats.org/wordprocessingml/2006/main" xmlns:w14="http://schemas.microsoft.com/office/word/2010/wordml" xmlns:w15="http://schemas.microsoft.com/office/word/2012/wordml" xmlns:w16cex="http://schemas.microsoft.com/office/word/2018/wordml/cex" xmlns:w16cid="http://schemas.microsoft.com/office/word/2016/wordml/cid" xmlns:w16="http://schemas.microsoft.com/office/word/2018/wordml" xmlns:w16du="http://schemas.microsoft.com/office/word/2023/wordml/word16du" xmlns:w16sdtdh="http://schemas.microsoft.com/office/word/2020/wordml/sdtdatahash" xmlns:w16se="http://schemas.microsoft.com/office/word/2015/wordml/symex" xmlns:wpg="http://schemas.microsoft.com/office/word/2010/wordprocessingGroup" xmlns:wpi="http://schemas.microsoft.com/office/word/2010/wordprocessingInk" xmlns:wne="http://schemas.microsoft.com/office/word/2006/wordml" xmlns:wps="http://schemas.microsoft.com/office/word/2010/wordprocessingShape" mc:Ignorable="w14 w15 w16se w16cid w16 w16cex w16sdtdh wp14">
+<w:document xmlns:wpc="http://schemas.microsoft.com/office/word/2010/wordprocessingCanvas" xmlns:cx="http://schemas.microsoft.com/office/drawing/2014/chartex" xmlns:cx1="http://schemas.microsoft.com/office/drawing/2015/9/8/chartex" xmlns:cx2="http://schemas.microsoft.com/office/drawing/2015/10/21/chartex" xmlns:cx3="http://schemas.microsoft.com/office/drawing/2016/5/9/chartex" xmlns:cx4="http://schemas.microsoft.com/office/drawing/2016/5/10/chartex" xmlns:cx5="http://schemas.microsoft.com/office/drawing/2016/5/11/chartex" xmlns:cx6="http://schemas.microsoft.com/office/drawing/2016/5/12/chartex" xmlns:cx7="http://schemas.microsoft.com/office/drawing/2016/5/13/chartex" xmlns:cx8="http://schemas.microsoft.com/office/drawing/2016/5/14/chartex" xmlns:mc="http://schemas.openxmlformats.org/markup-compatibility/2006" xmlns:aink="http://schemas.microsoft.com/office/drawing/2016/ink" xmlns:am3d="http://schemas.microsoft.com/office/drawing/2017/model3d" xmlns:o="urn:schemas-microsoft-com:office:office" xmlns:oel="http://schemas.microsoft.com/office/2019/extlst" xmlns:r="http://schemas.openxmlformats.org/officeDocument/2006/relationships" xmlns:m="http://schemas.openxmlformats.org/officeDocument/2006/math" xmlns:v="urn:schemas-microsoft-com:vml" xmlns:wp14="http://schemas.microsoft.com/office/word/2010/wordprocessingDrawing" xmlns:wp="http://schemas.openxmlformats.org/drawingml/2006/wordprocessingDrawing" xmlns:w10="urn:schemas-microsoft-com:office:word" xmlns:w="http://schemas.openxmlformats.org/wordprocessingml/2006/main" xmlns:w14="http://schemas.microsoft.com/office/word/2010/wordml" xmlns:w15="http://schemas.microsoft.com/office/word/2012/wordml" xmlns:w16cex="http://schemas.microsoft.com/office/word/2018/wordml/cex" xmlns:w16cid="http://schemas.microsoft.com/office/word/2016/wordml/cid" xmlns:w16="http://schemas.microsoft.com/office/word/2018/wordml" xmlns:w16du="http://schemas.microsoft.com/office/word/2023/wordml/word16du" xmlns:w16sdtdh="http://schemas.microsoft.com/office/word/2020/wordml/sdtdatahash" xmlns:w16sdtfl="http://schemas.microsoft.com/office/word/2024/wordml/sdtformatlock" xmlns:w16se="http://schemas.microsoft.com/office/word/2015/wordml/symex" xmlns:wpg="http://schemas.microsoft.com/office/word/2010/wordprocessingGroup" xmlns:wpi="http://schemas.microsoft.com/office/word/2010/wordprocessingInk" xmlns:wne="http://schemas.microsoft.com/office/word/2006/wordml" xmlns:wps="http://schemas.microsoft.com/office/word/2010/wordprocessingShape" mc:Ignorable="w14 w15 w16se w16cid w16 w16cex w16sdtdh w16sdtfl w16du wp14">
   <w:body>
     <w:p>
       <w:r>
@@ -44,8 +44,13 @@
     </w:p>
     <w:p>
       <w:r>
-        <w:t>Type: mcq</w:t>
-      </w:r>
+        <w:t xml:space="preserve">Type: </w:t>
+      </w:r>
+      <w:proofErr w:type="spellStart"/>
+      <w:r>
+        <w:t>mcq</w:t>
+      </w:r>
+      <w:proofErr w:type="spellEnd"/>
     </w:p>
     <w:p/>
     <w:p>
@@ -65,8 +70,13 @@
     </w:p>
     <w:p>
       <w:r>
-        <w:t>Type: truefalse</w:t>
-      </w:r>
+        <w:t xml:space="preserve">Type: </w:t>
+      </w:r>
+      <w:proofErr w:type="spellStart"/>
+      <w:r>
+        <w:t>truefalse</w:t>
+      </w:r>
+      <w:proofErr w:type="spellEnd"/>
     </w:p>
     <w:p/>
     <w:p>
@@ -154,45 +164,7 @@
       </w:r>
     </w:p>
     <w:p/>
-    <w:p>
-      <w:r>
-        <w:drawing>
-          <wp:inline distT="0" distB="0" distL="0" distR="0" wp14:anchorId="4BC905C4" wp14:editId="79EF0698">
-            <wp:extent cx="3934374" cy="4915586"/>
-            <wp:effectExtent l="0" t="0" r="9525" b="0"/>
-            <wp:docPr id="1" name="Picture 1"/>
-            <wp:cNvGraphicFramePr>
-              <a:graphicFrameLocks xmlns:a="http://schemas.openxmlformats.org/drawingml/2006/main" noChangeAspect="1"/>
-            </wp:cNvGraphicFramePr>
-            <a:graphic xmlns:a="http://schemas.openxmlformats.org/drawingml/2006/main">
-              <a:graphicData uri="http://schemas.openxmlformats.org/drawingml/2006/picture">
-                <pic:pic xmlns:pic="http://schemas.openxmlformats.org/drawingml/2006/picture">
-                  <pic:nvPicPr>
-                    <pic:cNvPr id="1" name=""/>
-                    <pic:cNvPicPr/>
-                  </pic:nvPicPr>
-                  <pic:blipFill>
-                    <a:blip r:embed="rId4"/>
-                    <a:stretch>
-                      <a:fillRect/>
-                    </a:stretch>
-                  </pic:blipFill>
-                  <pic:spPr>
-                    <a:xfrm>
-                      <a:off x="0" y="0"/>
-                      <a:ext cx="3934374" cy="4915586"/>
-                    </a:xfrm>
-                    <a:prstGeom prst="rect">
-                      <a:avLst/>
-                    </a:prstGeom>
-                  </pic:spPr>
-                </pic:pic>
-              </a:graphicData>
-            </a:graphic>
-          </wp:inline>
-        </w:drawing>
-      </w:r>
-    </w:p>
+    <w:p/>
     <w:sectPr>
       <w:pgSz w:w="11906" w:h="16838"/>
       <w:pgMar w:top="1440" w:right="1440" w:bottom="1440" w:left="1440" w:header="708" w:footer="708" w:gutter="0"/>
@@ -204,7 +176,7 @@
 </file>
 
 <file path=word/styles.xml><?xml version="1.0" encoding="utf-8"?>
-<w:styles xmlns:mc="http://schemas.openxmlformats.org/markup-compatibility/2006" xmlns:r="http://schemas.openxmlformats.org/officeDocument/2006/relationships" xmlns:w="http://schemas.openxmlformats.org/wordprocessingml/2006/main" xmlns:w14="http://schemas.microsoft.com/office/word/2010/wordml" xmlns:w15="http://schemas.microsoft.com/office/word/2012/wordml" xmlns:w16cex="http://schemas.microsoft.com/office/word/2018/wordml/cex" xmlns:w16cid="http://schemas.microsoft.com/office/word/2016/wordml/cid" xmlns:w16="http://schemas.microsoft.com/office/word/2018/wordml" xmlns:w16sdtdh="http://schemas.microsoft.com/office/word/2020/wordml/sdtdatahash" xmlns:w16se="http://schemas.microsoft.com/office/word/2015/wordml/symex" mc:Ignorable="w14 w15 w16se w16cid w16 w16cex w16sdtdh">
+<w:styles xmlns:mc="http://schemas.openxmlformats.org/markup-compatibility/2006" xmlns:r="http://schemas.openxmlformats.org/officeDocument/2006/relationships" xmlns:w="http://schemas.openxmlformats.org/wordprocessingml/2006/main" xmlns:w14="http://schemas.microsoft.com/office/word/2010/wordml" xmlns:w15="http://schemas.microsoft.com/office/word/2012/wordml" xmlns:w16cex="http://schemas.microsoft.com/office/word/2018/wordml/cex" xmlns:w16cid="http://schemas.microsoft.com/office/word/2016/wordml/cid" xmlns:w16="http://schemas.microsoft.com/office/word/2018/wordml" xmlns:w16du="http://schemas.microsoft.com/office/word/2023/wordml/word16du" xmlns:w16sdtdh="http://schemas.microsoft.com/office/word/2020/wordml/sdtdatahash" xmlns:w16sdtfl="http://schemas.microsoft.com/office/word/2024/wordml/sdtformatlock" xmlns:w16se="http://schemas.microsoft.com/office/word/2015/wordml/symex" mc:Ignorable="w14 w15 w16se w16cid w16 w16cex w16sdtdh w16sdtfl w16du">
   <w:docDefaults>
     <w:rPrDefault>
       <w:rPr>

</xml_diff>